<commit_message>
Fixed the code so you can use the run all function inside the google colab (skipping all cells except 3 and 4
</commit_message>
<xml_diff>
--- a/HW3_SLOTH/HW3_SLOTH.docx
+++ b/HW3_SLOTH/HW3_SLOTH.docx
@@ -1,6 +1,6 @@
 
 <file path=word/document.xml><?xml version="1.0" encoding="utf-8"?>
-<w:document xmlns:wpc="http://schemas.microsoft.com/office/word/2010/wordprocessingCanvas" xmlns:cx="http://schemas.microsoft.com/office/drawing/2014/chartex" xmlns:cx1="http://schemas.microsoft.com/office/drawing/2015/9/8/chartex" xmlns:cx2="http://schemas.microsoft.com/office/drawing/2015/10/21/chartex" xmlns:cx3="http://schemas.microsoft.com/office/drawing/2016/5/9/chartex" xmlns:cx4="http://schemas.microsoft.com/office/drawing/2016/5/10/chartex" xmlns:cx5="http://schemas.microsoft.com/office/drawing/2016/5/11/chartex" xmlns:cx6="http://schemas.microsoft.com/office/drawing/2016/5/12/chartex" xmlns:cx7="http://schemas.microsoft.com/office/drawing/2016/5/13/chartex" xmlns:cx8="http://schemas.microsoft.com/office/drawing/2016/5/14/chartex" xmlns:mc="http://schemas.openxmlformats.org/markup-compatibility/2006" xmlns:aink="http://schemas.microsoft.com/office/drawing/2016/ink" xmlns:am3d="http://schemas.microsoft.com/office/drawing/2017/model3d" xmlns:o="urn:schemas-microsoft-com:office:office" xmlns:oel="http://schemas.microsoft.com/office/2019/extlst" xmlns:r="http://schemas.openxmlformats.org/officeDocument/2006/relationships" xmlns:m="http://schemas.openxmlformats.org/officeDocument/2006/math" xmlns:v="urn:schemas-microsoft-com:vml" xmlns:wp14="http://schemas.microsoft.com/office/word/2010/wordprocessingDrawing" xmlns:wp="http://schemas.openxmlformats.org/drawingml/2006/wordprocessingDrawing" xmlns:w10="urn:schemas-microsoft-com:office:word" xmlns:w="http://schemas.openxmlformats.org/wordprocessingml/2006/main" xmlns:w14="http://schemas.microsoft.com/office/word/2010/wordml" xmlns:w15="http://schemas.microsoft.com/office/word/2012/wordml" xmlns:w16cex="http://schemas.microsoft.com/office/word/2018/wordml/cex" xmlns:w16cid="http://schemas.microsoft.com/office/word/2016/wordml/cid" xmlns:w16="http://schemas.microsoft.com/office/word/2018/wordml" xmlns:w16du="http://schemas.microsoft.com/office/word/2023/wordml/word16du" xmlns:w16sdtdh="http://schemas.microsoft.com/office/word/2020/wordml/sdtdatahash" xmlns:w16sdtfl="http://schemas.microsoft.com/office/word/2024/wordml/sdtformatlock" xmlns:w16se="http://schemas.microsoft.com/office/word/2015/wordml/symex" xmlns:wpg="http://schemas.microsoft.com/office/word/2010/wordprocessingGroup" xmlns:wpi="http://schemas.microsoft.com/office/word/2010/wordprocessingInk" xmlns:wne="http://schemas.microsoft.com/office/word/2006/wordml" xmlns:wps="http://schemas.microsoft.com/office/word/2010/wordprocessingShape" mc:Ignorable="w14 w15 w16se w16cid w16 w16cex w16sdtdh w16sdtfl w16du wp14">
+<w:document xmlns:wpc="http://schemas.microsoft.com/office/word/2010/wordprocessingCanvas" xmlns:cx="http://schemas.microsoft.com/office/drawing/2014/chartex" xmlns:cx1="http://schemas.microsoft.com/office/drawing/2015/9/8/chartex" xmlns:cx2="http://schemas.microsoft.com/office/drawing/2015/10/21/chartex" xmlns:cx3="http://schemas.microsoft.com/office/drawing/2016/5/9/chartex" xmlns:cx4="http://schemas.microsoft.com/office/drawing/2016/5/10/chartex" xmlns:cx5="http://schemas.microsoft.com/office/drawing/2016/5/11/chartex" xmlns:cx6="http://schemas.microsoft.com/office/drawing/2016/5/12/chartex" xmlns:cx7="http://schemas.microsoft.com/office/drawing/2016/5/13/chartex" xmlns:cx8="http://schemas.microsoft.com/office/drawing/2016/5/14/chartex" xmlns:mc="http://schemas.openxmlformats.org/markup-compatibility/2006" xmlns:aink="http://schemas.microsoft.com/office/drawing/2016/ink" xmlns:am3d="http://schemas.microsoft.com/office/drawing/2017/model3d" xmlns:o="urn:schemas-microsoft-com:office:office" xmlns:oel="http://schemas.microsoft.com/office/2019/extlst" xmlns:r="http://schemas.openxmlformats.org/officeDocument/2006/relationships" xmlns:m="http://schemas.openxmlformats.org/officeDocument/2006/math" xmlns:v="urn:schemas-microsoft-com:vml" xmlns:wp14="http://schemas.microsoft.com/office/word/2010/wordprocessingDrawing" xmlns:wp="http://schemas.openxmlformats.org/drawingml/2006/wordprocessingDrawing" xmlns:w10="urn:schemas-microsoft-com:office:word" xmlns:w="http://schemas.openxmlformats.org/wordprocessingml/2006/main" xmlns:w14="http://schemas.microsoft.com/office/word/2010/wordml" xmlns:w15="http://schemas.microsoft.com/office/word/2012/wordml" xmlns:w16cex="http://schemas.microsoft.com/office/word/2018/wordml/cex" xmlns:w16cid="http://schemas.microsoft.com/office/word/2016/wordml/cid" xmlns:w16="http://schemas.microsoft.com/office/word/2018/wordml" xmlns:w16sdtdh="http://schemas.microsoft.com/office/word/2020/wordml/sdtdatahash" xmlns:w16se="http://schemas.microsoft.com/office/word/2015/wordml/symex" xmlns:wpg="http://schemas.microsoft.com/office/word/2010/wordprocessingGroup" xmlns:wpi="http://schemas.microsoft.com/office/word/2010/wordprocessingInk" xmlns:wne="http://schemas.microsoft.com/office/word/2006/wordml" xmlns:wps="http://schemas.microsoft.com/office/word/2010/wordprocessingShape" mc:Ignorable="w14 w15 w16se w16cid w16 w16cex w16sdtdh wp14">
   <w:body>
     <w:p>
       <w:pPr>
@@ -140,7 +140,25 @@
                 <w:bCs/>
                 <w:rtl/>
               </w:rPr>
-              <w:t>קישור לתיקיית גיט:</w:t>
+              <w:t xml:space="preserve">קישור לתיקיית </w:t>
+            </w:r>
+            <w:proofErr w:type="spellStart"/>
+            <w:r>
+              <w:rPr>
+                <w:b/>
+                <w:bCs/>
+                <w:rtl/>
+              </w:rPr>
+              <w:t>גיט</w:t>
+            </w:r>
+            <w:proofErr w:type="spellEnd"/>
+            <w:r>
+              <w:rPr>
+                <w:b/>
+                <w:bCs/>
+                <w:rtl/>
+              </w:rPr>
+              <w:t>:</w:t>
             </w:r>
           </w:p>
         </w:tc>
@@ -158,7 +176,7 @@
     </w:tbl>
     <w:p>
       <w:pPr>
-        <w:pStyle w:val="Heading1"/>
+        <w:pStyle w:val="1"/>
         <w:bidi/>
         <w:spacing w:after="300"/>
         <w:rPr>
@@ -291,13 +309,41 @@
             <w:pPr>
               <w:jc w:val="center"/>
             </w:pPr>
+            <w:proofErr w:type="spellStart"/>
             <w:r>
               <w:rPr>
                 <w:b/>
                 <w:bCs/>
                 <w:rtl/>
               </w:rPr>
-              <w:t>Acceptance test – בדיקת קבלה</w:t>
+              <w:t>Acceptance</w:t>
+            </w:r>
+            <w:proofErr w:type="spellEnd"/>
+            <w:r>
+              <w:rPr>
+                <w:b/>
+                <w:bCs/>
+                <w:rtl/>
+              </w:rPr>
+              <w:t xml:space="preserve"> </w:t>
+            </w:r>
+            <w:proofErr w:type="spellStart"/>
+            <w:r>
+              <w:rPr>
+                <w:b/>
+                <w:bCs/>
+                <w:rtl/>
+              </w:rPr>
+              <w:t>test</w:t>
+            </w:r>
+            <w:proofErr w:type="spellEnd"/>
+            <w:r>
+              <w:rPr>
+                <w:b/>
+                <w:bCs/>
+                <w:rtl/>
+              </w:rPr>
+              <w:t xml:space="preserve"> – בדיקת קבלה</w:t>
             </w:r>
           </w:p>
         </w:tc>
@@ -321,11 +367,33 @@
             <w:pPr>
               <w:jc w:val="center"/>
             </w:pPr>
-            <w:r>
-              <w:rPr>
-                <w:rtl/>
-              </w:rPr>
-              <w:t>אנדריי בלוזיורוב (327443180)</w:t>
+            <w:proofErr w:type="spellStart"/>
+            <w:r>
+              <w:rPr>
+                <w:rtl/>
+              </w:rPr>
+              <w:t>אנדריי</w:t>
+            </w:r>
+            <w:proofErr w:type="spellEnd"/>
+            <w:r>
+              <w:rPr>
+                <w:rtl/>
+              </w:rPr>
+              <w:t xml:space="preserve"> </w:t>
+            </w:r>
+            <w:proofErr w:type="spellStart"/>
+            <w:r>
+              <w:rPr>
+                <w:rtl/>
+              </w:rPr>
+              <w:t>בלוזיורוב</w:t>
+            </w:r>
+            <w:proofErr w:type="spellEnd"/>
+            <w:r>
+              <w:rPr>
+                <w:rtl/>
+              </w:rPr>
+              <w:t xml:space="preserve"> (327443180)</w:t>
             </w:r>
           </w:p>
         </w:tc>
@@ -347,8 +415,30 @@
               <w:rPr>
                 <w:rtl/>
               </w:rPr>
-              <w:t>פיתוח שירות החיישנים - חיבור לשרת ה-IoT של הקורס ושמירת הקריאות ב-Firebase</w:t>
-            </w:r>
+              <w:t>פיתוח שירות החיישנים - חיבור לשרת ה-</w:t>
+            </w:r>
+            <w:proofErr w:type="spellStart"/>
+            <w:r>
+              <w:rPr>
+                <w:rtl/>
+              </w:rPr>
+              <w:t>IoT</w:t>
+            </w:r>
+            <w:proofErr w:type="spellEnd"/>
+            <w:r>
+              <w:rPr>
+                <w:rtl/>
+              </w:rPr>
+              <w:t xml:space="preserve"> של הקורס ושמירת הקריאות ב-</w:t>
+            </w:r>
+            <w:proofErr w:type="spellStart"/>
+            <w:r>
+              <w:rPr>
+                <w:rtl/>
+              </w:rPr>
+              <w:t>Firebase</w:t>
+            </w:r>
+            <w:proofErr w:type="spellEnd"/>
           </w:p>
         </w:tc>
         <w:tc>
@@ -365,6 +455,7 @@
             <w:pPr>
               <w:jc w:val="right"/>
             </w:pPr>
+            <w:proofErr w:type="spellStart"/>
             <w:r>
               <w:rPr>
                 <w:rFonts w:hint="cs"/>
@@ -372,6 +463,7 @@
               </w:rPr>
               <w:t>הכל</w:t>
             </w:r>
+            <w:proofErr w:type="spellEnd"/>
           </w:p>
         </w:tc>
         <w:tc>
@@ -392,7 +484,49 @@
               <w:rPr>
                 <w:rtl/>
               </w:rPr>
-              <w:t xml:space="preserve">נבדק כי קריאות החיישנים מתעדכנות בזמן אמת בטאב Sensors ונשמרות ב-Firebase </w:t>
+              <w:t xml:space="preserve">נבדק כי קריאות החיישנים מתעדכנות בזמן אמת </w:t>
+            </w:r>
+            <w:proofErr w:type="spellStart"/>
+            <w:r>
+              <w:rPr>
+                <w:rtl/>
+              </w:rPr>
+              <w:t>בטאב</w:t>
+            </w:r>
+            <w:proofErr w:type="spellEnd"/>
+            <w:r>
+              <w:rPr>
+                <w:rtl/>
+              </w:rPr>
+              <w:t xml:space="preserve"> </w:t>
+            </w:r>
+            <w:proofErr w:type="spellStart"/>
+            <w:r>
+              <w:rPr>
+                <w:rtl/>
+              </w:rPr>
+              <w:t>Sensors</w:t>
+            </w:r>
+            <w:proofErr w:type="spellEnd"/>
+            <w:r>
+              <w:rPr>
+                <w:rtl/>
+              </w:rPr>
+              <w:t xml:space="preserve"> ונשמרות ב-</w:t>
+            </w:r>
+            <w:proofErr w:type="spellStart"/>
+            <w:r>
+              <w:rPr>
+                <w:rtl/>
+              </w:rPr>
+              <w:t>Firebase</w:t>
+            </w:r>
+            <w:proofErr w:type="spellEnd"/>
+            <w:r>
+              <w:rPr>
+                <w:rtl/>
+              </w:rPr>
+              <w:t xml:space="preserve"> </w:t>
             </w:r>
           </w:p>
         </w:tc>
@@ -442,8 +576,16 @@
               <w:rPr>
                 <w:rtl/>
               </w:rPr>
-              <w:t>פיתוח לוח הבקרה - חישוב ציון בריאות, התראות, צ'ק-ליסט יומי ומנגנון ה-Streak</w:t>
-            </w:r>
+              <w:t>פיתוח לוח הבקרה - חישוב ציון בריאות, התראות, צ'ק-ליסט יומי ומנגנון ה-</w:t>
+            </w:r>
+            <w:proofErr w:type="spellStart"/>
+            <w:r>
+              <w:rPr>
+                <w:rtl/>
+              </w:rPr>
+              <w:t>Streak</w:t>
+            </w:r>
+            <w:proofErr w:type="spellEnd"/>
           </w:p>
         </w:tc>
         <w:tc>
@@ -460,6 +602,7 @@
             <w:pPr>
               <w:jc w:val="right"/>
             </w:pPr>
+            <w:proofErr w:type="spellStart"/>
             <w:r>
               <w:rPr>
                 <w:rFonts w:hint="cs"/>
@@ -467,6 +610,7 @@
               </w:rPr>
               <w:t>הכל</w:t>
             </w:r>
+            <w:proofErr w:type="spellEnd"/>
           </w:p>
         </w:tc>
         <w:tc>
@@ -487,7 +631,21 @@
               <w:rPr>
                 <w:rtl/>
               </w:rPr>
-              <w:t>נבדק כי הציון וההתראות מתעדכנים לפי קריאות החיישנים וכי ה-Streak נשמר</w:t>
+              <w:t>נבדק כי הציון וההתראות מתעדכנים לפי קריאות החיישנים וכי ה-</w:t>
+            </w:r>
+            <w:proofErr w:type="spellStart"/>
+            <w:r>
+              <w:rPr>
+                <w:rtl/>
+              </w:rPr>
+              <w:t>Streak</w:t>
+            </w:r>
+            <w:proofErr w:type="spellEnd"/>
+            <w:r>
+              <w:rPr>
+                <w:rtl/>
+              </w:rPr>
+              <w:t xml:space="preserve"> נשמר</w:t>
             </w:r>
           </w:p>
         </w:tc>
@@ -537,7 +695,35 @@
               <w:rPr>
                 <w:rtl/>
               </w:rPr>
-              <w:t>איתור דאטהסט תמונות רוזמרין ואימון מודל ViT לסיווג מצב הצמח</w:t>
+              <w:t xml:space="preserve">איתור </w:t>
+            </w:r>
+            <w:proofErr w:type="spellStart"/>
+            <w:r>
+              <w:rPr>
+                <w:rtl/>
+              </w:rPr>
+              <w:t>דאטהסט</w:t>
+            </w:r>
+            <w:proofErr w:type="spellEnd"/>
+            <w:r>
+              <w:rPr>
+                <w:rtl/>
+              </w:rPr>
+              <w:t xml:space="preserve"> תמונות רוזמרין ואימון מודל </w:t>
+            </w:r>
+            <w:proofErr w:type="spellStart"/>
+            <w:r>
+              <w:rPr>
+                <w:rtl/>
+              </w:rPr>
+              <w:t>ViT</w:t>
+            </w:r>
+            <w:proofErr w:type="spellEnd"/>
+            <w:r>
+              <w:rPr>
+                <w:rtl/>
+              </w:rPr>
+              <w:t xml:space="preserve"> לסיווג מצב הצמח</w:t>
             </w:r>
           </w:p>
         </w:tc>
@@ -555,6 +741,7 @@
             <w:pPr>
               <w:jc w:val="right"/>
             </w:pPr>
+            <w:proofErr w:type="spellStart"/>
             <w:r>
               <w:rPr>
                 <w:rFonts w:hint="cs"/>
@@ -562,6 +749,7 @@
               </w:rPr>
               <w:t>הכל</w:t>
             </w:r>
+            <w:proofErr w:type="spellEnd"/>
           </w:p>
         </w:tc>
         <w:tc>
@@ -582,7 +770,35 @@
               <w:rPr>
                 <w:rtl/>
               </w:rPr>
-              <w:t>נבדק כי העלאת תמונת צמח בטאב Upload מחזירה סיווג בריא/חולה תקין</w:t>
+              <w:t xml:space="preserve">נבדק כי העלאת תמונת צמח </w:t>
+            </w:r>
+            <w:proofErr w:type="spellStart"/>
+            <w:r>
+              <w:rPr>
+                <w:rtl/>
+              </w:rPr>
+              <w:t>בטאב</w:t>
+            </w:r>
+            <w:proofErr w:type="spellEnd"/>
+            <w:r>
+              <w:rPr>
+                <w:rtl/>
+              </w:rPr>
+              <w:t xml:space="preserve"> </w:t>
+            </w:r>
+            <w:proofErr w:type="spellStart"/>
+            <w:r>
+              <w:rPr>
+                <w:rtl/>
+              </w:rPr>
+              <w:t>Upload</w:t>
+            </w:r>
+            <w:proofErr w:type="spellEnd"/>
+            <w:r>
+              <w:rPr>
+                <w:rtl/>
+              </w:rPr>
+              <w:t xml:space="preserve"> מחזירה סיווג בריא/חולה תקין</w:t>
             </w:r>
           </w:p>
         </w:tc>
@@ -632,8 +848,30 @@
               <w:rPr>
                 <w:rtl/>
               </w:rPr>
-              <w:t>פיתוח מנוע החיפוש RAG ואינדוקס המאמרים, ואינטגרציה עם Gemini לצ'אטבוט</w:t>
-            </w:r>
+              <w:t xml:space="preserve">פיתוח מנוע החיפוש RAG ואינדוקס המאמרים, ואינטגרציה עם </w:t>
+            </w:r>
+            <w:proofErr w:type="spellStart"/>
+            <w:r>
+              <w:rPr>
+                <w:rtl/>
+              </w:rPr>
+              <w:t>Gemini</w:t>
+            </w:r>
+            <w:proofErr w:type="spellEnd"/>
+            <w:r>
+              <w:rPr>
+                <w:rtl/>
+              </w:rPr>
+              <w:t xml:space="preserve"> </w:t>
+            </w:r>
+            <w:proofErr w:type="spellStart"/>
+            <w:r>
+              <w:rPr>
+                <w:rtl/>
+              </w:rPr>
+              <w:t>לצ'אטבוט</w:t>
+            </w:r>
+            <w:proofErr w:type="spellEnd"/>
           </w:p>
         </w:tc>
         <w:tc>
@@ -650,6 +888,7 @@
             <w:pPr>
               <w:jc w:val="right"/>
             </w:pPr>
+            <w:proofErr w:type="spellStart"/>
             <w:r>
               <w:rPr>
                 <w:rFonts w:hint="cs"/>
@@ -657,6 +896,7 @@
               </w:rPr>
               <w:t>הכל</w:t>
             </w:r>
+            <w:proofErr w:type="spellEnd"/>
           </w:p>
         </w:tc>
         <w:tc>
@@ -677,7 +917,49 @@
               <w:rPr>
                 <w:rtl/>
               </w:rPr>
-              <w:t>נבדק כי שאילתות בטאב Search מחזירות קטעים רלוונטיים מהמאמרים, וכי הצ'אטבוט עונה תשובות מבוססות-מקור</w:t>
+              <w:t xml:space="preserve">נבדק כי שאילתות </w:t>
+            </w:r>
+            <w:proofErr w:type="spellStart"/>
+            <w:r>
+              <w:rPr>
+                <w:rtl/>
+              </w:rPr>
+              <w:t>בטאב</w:t>
+            </w:r>
+            <w:proofErr w:type="spellEnd"/>
+            <w:r>
+              <w:rPr>
+                <w:rtl/>
+              </w:rPr>
+              <w:t xml:space="preserve"> </w:t>
+            </w:r>
+            <w:proofErr w:type="spellStart"/>
+            <w:r>
+              <w:rPr>
+                <w:rtl/>
+              </w:rPr>
+              <w:t>Search</w:t>
+            </w:r>
+            <w:proofErr w:type="spellEnd"/>
+            <w:r>
+              <w:rPr>
+                <w:rtl/>
+              </w:rPr>
+              <w:t xml:space="preserve"> מחזירות קטעים רלוונטיים מהמאמרים, וכי </w:t>
+            </w:r>
+            <w:proofErr w:type="spellStart"/>
+            <w:r>
+              <w:rPr>
+                <w:rtl/>
+              </w:rPr>
+              <w:t>הצ'אטבוט</w:t>
+            </w:r>
+            <w:proofErr w:type="spellEnd"/>
+            <w:r>
+              <w:rPr>
+                <w:rtl/>
+              </w:rPr>
+              <w:t xml:space="preserve"> עונה תשובות מבוססות-מקור</w:t>
             </w:r>
           </w:p>
         </w:tc>
@@ -727,7 +1009,21 @@
               <w:rPr>
                 <w:rtl/>
               </w:rPr>
-              <w:t>פיתוח חלק ה-Frontend (HTML/CSS/JS, Chart.js) וריכוז התיעוד (KPI, תיק מתכנת ומשתמש)</w:t>
+              <w:t>פיתוח חלק ה-</w:t>
+            </w:r>
+            <w:proofErr w:type="spellStart"/>
+            <w:r>
+              <w:rPr>
+                <w:rtl/>
+              </w:rPr>
+              <w:t>Frontend</w:t>
+            </w:r>
+            <w:proofErr w:type="spellEnd"/>
+            <w:r>
+              <w:rPr>
+                <w:rtl/>
+              </w:rPr>
+              <w:t xml:space="preserve"> (HTML/CSS/JS, Chart.js) וריכוז התיעוד (KPI, תיק מתכנת ומשתמש)</w:t>
             </w:r>
           </w:p>
         </w:tc>
@@ -745,6 +1041,7 @@
             <w:pPr>
               <w:jc w:val="right"/>
             </w:pPr>
+            <w:proofErr w:type="spellStart"/>
             <w:r>
               <w:rPr>
                 <w:rFonts w:hint="cs"/>
@@ -752,6 +1049,7 @@
               </w:rPr>
               <w:t>הכל</w:t>
             </w:r>
+            <w:proofErr w:type="spellEnd"/>
           </w:p>
         </w:tc>
         <w:tc>
@@ -772,7 +1070,49 @@
               <w:rPr>
                 <w:rtl/>
               </w:rPr>
-              <w:t>נבדק כי כל חמשת הטאבים עולים ופועלים כראוי בתוך ה-Colab notebook ללא שגיאות</w:t>
+              <w:t xml:space="preserve">נבדק כי כל חמשת </w:t>
+            </w:r>
+            <w:proofErr w:type="spellStart"/>
+            <w:r>
+              <w:rPr>
+                <w:rtl/>
+              </w:rPr>
+              <w:t>הטאבים</w:t>
+            </w:r>
+            <w:proofErr w:type="spellEnd"/>
+            <w:r>
+              <w:rPr>
+                <w:rtl/>
+              </w:rPr>
+              <w:t xml:space="preserve"> עולים ופועלים כראוי בתוך ה-</w:t>
+            </w:r>
+            <w:proofErr w:type="spellStart"/>
+            <w:r>
+              <w:rPr>
+                <w:rtl/>
+              </w:rPr>
+              <w:t>Colab</w:t>
+            </w:r>
+            <w:proofErr w:type="spellEnd"/>
+            <w:r>
+              <w:rPr>
+                <w:rtl/>
+              </w:rPr>
+              <w:t xml:space="preserve"> </w:t>
+            </w:r>
+            <w:proofErr w:type="spellStart"/>
+            <w:r>
+              <w:rPr>
+                <w:rtl/>
+              </w:rPr>
+              <w:t>notebook</w:t>
+            </w:r>
+            <w:proofErr w:type="spellEnd"/>
+            <w:r>
+              <w:rPr>
+                <w:rtl/>
+              </w:rPr>
+              <w:t xml:space="preserve"> ללא שגיאות</w:t>
             </w:r>
           </w:p>
         </w:tc>
@@ -788,7 +1128,7 @@
     </w:p>
     <w:p>
       <w:pPr>
-        <w:pStyle w:val="Heading1"/>
+        <w:pStyle w:val="1"/>
         <w:bidi/>
         <w:spacing w:after="300"/>
         <w:rPr>
@@ -808,6 +1148,7 @@
           <w:sz w:val="28"/>
           <w:szCs w:val="28"/>
         </w:rPr>
+        <w:lastRenderedPageBreak/>
         <w:t xml:space="preserve">2. </w:t>
       </w:r>
       <w:r>
@@ -859,7 +1200,7 @@
     </w:p>
     <w:p>
       <w:pPr>
-        <w:pStyle w:val="ListParagraph"/>
+        <w:pStyle w:val="a4"/>
         <w:numPr>
           <w:ilvl w:val="0"/>
           <w:numId w:val="1"/>
@@ -913,8 +1254,13 @@
         <w:t>שרידות נתונים מלאה גם במקרה של קריסת או אתחול ה</w:t>
       </w:r>
       <w:r>
-        <w:t>-Colab</w:t>
-      </w:r>
+        <w:t>-</w:t>
+      </w:r>
+      <w:proofErr w:type="spellStart"/>
+      <w:r>
+        <w:t>Colab</w:t>
+      </w:r>
+      <w:proofErr w:type="spellEnd"/>
       <w:r>
         <w:rPr>
           <w:rFonts w:hint="cs"/>
@@ -925,7 +1271,7 @@
     </w:p>
     <w:p>
       <w:pPr>
-        <w:pStyle w:val="ListParagraph"/>
+        <w:pStyle w:val="a4"/>
         <w:numPr>
           <w:ilvl w:val="0"/>
           <w:numId w:val="1"/>
@@ -953,12 +1299,14 @@
       <w:r>
         <w:t xml:space="preserve"> </w:t>
       </w:r>
+      <w:proofErr w:type="spellStart"/>
       <w:r>
         <w:rPr>
           <w:rtl/>
         </w:rPr>
         <w:t>פיד</w:t>
       </w:r>
+      <w:proofErr w:type="spellEnd"/>
       <w:r>
         <w:t xml:space="preserve"> IoT </w:t>
       </w:r>
@@ -966,7 +1314,35 @@
         <w:rPr>
           <w:rtl/>
         </w:rPr>
-        <w:t xml:space="preserve">חיצוני המנגיש את מדדי החיישנים הגולמיים (טמפרטורה, לחות, לחות קרקע). השרת משמש כשכבת פרוקסי המסתירה את </w:t>
+        <w:t xml:space="preserve">חיצוני </w:t>
+      </w:r>
+      <w:proofErr w:type="spellStart"/>
+      <w:r>
+        <w:rPr>
+          <w:rtl/>
+        </w:rPr>
+        <w:t>המנגיש</w:t>
+      </w:r>
+      <w:proofErr w:type="spellEnd"/>
+      <w:r>
+        <w:rPr>
+          <w:rtl/>
+        </w:rPr>
+        <w:t xml:space="preserve"> את מדדי החיישנים הגולמיים (טמפרטורה, לחות, לחות קרקע). השרת משמש כשכבת </w:t>
+      </w:r>
+      <w:proofErr w:type="spellStart"/>
+      <w:r>
+        <w:rPr>
+          <w:rtl/>
+        </w:rPr>
+        <w:t>פרוקסי</w:t>
+      </w:r>
+      <w:proofErr w:type="spellEnd"/>
+      <w:r>
+        <w:rPr>
+          <w:rtl/>
+        </w:rPr>
+        <w:t xml:space="preserve"> המסתירה את </w:t>
       </w:r>
       <w:r>
         <w:rPr>
@@ -997,7 +1373,7 @@
     </w:p>
     <w:p>
       <w:pPr>
-        <w:pStyle w:val="ListParagraph"/>
+        <w:pStyle w:val="a4"/>
         <w:numPr>
           <w:ilvl w:val="0"/>
           <w:numId w:val="1"/>
@@ -1087,7 +1463,7 @@
     </w:p>
     <w:p>
       <w:pPr>
-        <w:pStyle w:val="ListParagraph"/>
+        <w:pStyle w:val="a4"/>
         <w:numPr>
           <w:ilvl w:val="0"/>
           <w:numId w:val="1"/>
@@ -1124,7 +1500,21 @@
         <w:rPr>
           <w:rtl/>
         </w:rPr>
-        <w:t xml:space="preserve"> הצ'אטבוט ליצירת תשובות מבוססות בשפה טבעית, על סמך שאילתת המשתמש והמסמכים הרלוונטיים שנשלפו</w:t>
+        <w:t xml:space="preserve"> </w:t>
+      </w:r>
+      <w:proofErr w:type="spellStart"/>
+      <w:r>
+        <w:rPr>
+          <w:rtl/>
+        </w:rPr>
+        <w:t>הצ'אטבוט</w:t>
+      </w:r>
+      <w:proofErr w:type="spellEnd"/>
+      <w:r>
+        <w:rPr>
+          <w:rtl/>
+        </w:rPr>
+        <w:t xml:space="preserve"> ליצירת תשובות מבוססות בשפה טבעית, על סמך שאילתת המשתמש והמסמכים הרלוונטיים שנשלפו</w:t>
       </w:r>
       <w:r>
         <w:t>.</w:t>
@@ -1137,7 +1527,7 @@
     </w:p>
     <w:p>
       <w:pPr>
-        <w:pStyle w:val="Heading1"/>
+        <w:pStyle w:val="1"/>
         <w:bidi/>
         <w:rPr>
           <w:b/>
@@ -1219,7 +1609,63 @@
         <w:rPr>
           <w:rtl/>
         </w:rPr>
-        <w:t xml:space="preserve"> שיעור הזמן שבו האפליקציה והתלויות החיצוניות שלה (Firebase, Hugging Face, Gemini, ושרת החיישנים) זמינות ומגיבות למשתמש. מאחר שהארכיטקטורה שלנו נשענת על ארבעה שירותי צד-שלישי, זמינות המערכת האפקטיבית מוגבלת לחוליה החלשה ביותר בשרשרת.</w:t>
+        <w:t xml:space="preserve"> שיעור הזמן שבו האפליקציה והתלויות החיצוניות שלה (</w:t>
+      </w:r>
+      <w:proofErr w:type="spellStart"/>
+      <w:r>
+        <w:rPr>
+          <w:rtl/>
+        </w:rPr>
+        <w:t>Firebase</w:t>
+      </w:r>
+      <w:proofErr w:type="spellEnd"/>
+      <w:r>
+        <w:rPr>
+          <w:rtl/>
+        </w:rPr>
+        <w:t xml:space="preserve">, </w:t>
+      </w:r>
+      <w:proofErr w:type="spellStart"/>
+      <w:r>
+        <w:rPr>
+          <w:rtl/>
+        </w:rPr>
+        <w:t>Hugging</w:t>
+      </w:r>
+      <w:proofErr w:type="spellEnd"/>
+      <w:r>
+        <w:rPr>
+          <w:rtl/>
+        </w:rPr>
+        <w:t xml:space="preserve"> </w:t>
+      </w:r>
+      <w:proofErr w:type="spellStart"/>
+      <w:r>
+        <w:rPr>
+          <w:rtl/>
+        </w:rPr>
+        <w:t>Face</w:t>
+      </w:r>
+      <w:proofErr w:type="spellEnd"/>
+      <w:r>
+        <w:rPr>
+          <w:rtl/>
+        </w:rPr>
+        <w:t xml:space="preserve">, </w:t>
+      </w:r>
+      <w:proofErr w:type="spellStart"/>
+      <w:r>
+        <w:rPr>
+          <w:rtl/>
+        </w:rPr>
+        <w:t>Gemini</w:t>
+      </w:r>
+      <w:proofErr w:type="spellEnd"/>
+      <w:r>
+        <w:rPr>
+          <w:rtl/>
+        </w:rPr>
+        <w:t>, ושרת החיישנים) זמינות ומגיבות למשתמש. מאחר שהארכיטקטורה שלנו נשענת על ארבעה שירותי צד-שלישי, זמינות המערכת האפקטיבית מוגבלת לחוליה החלשה ביותר בשרשרת.</w:t>
       </w:r>
     </w:p>
     <w:p>
@@ -1238,7 +1684,49 @@
         <w:rPr>
           <w:rtl/>
         </w:rPr>
-        <w:t xml:space="preserve"> הזמן שעובר מביצוע פעולת משתמש ועד לקבלת תוצאה, המושפע בעיקר מזמן ה-Inference של מודל ה-ViT והקריאה ל-Gemini API. מדד זה קובע ישירות את חוויית השימוש והוא המדד הרגיש ביותר לגודל המודלים ולמספר </w:t>
+        <w:t xml:space="preserve"> הזמן שעובר מביצוע פעולת משתמש ועד לקבלת תוצאה, המושפע בעיקר מזמן ה-</w:t>
+      </w:r>
+      <w:proofErr w:type="spellStart"/>
+      <w:r>
+        <w:rPr>
+          <w:rtl/>
+        </w:rPr>
+        <w:t>Inference</w:t>
+      </w:r>
+      <w:proofErr w:type="spellEnd"/>
+      <w:r>
+        <w:rPr>
+          <w:rtl/>
+        </w:rPr>
+        <w:t xml:space="preserve"> של מודל ה-</w:t>
+      </w:r>
+      <w:proofErr w:type="spellStart"/>
+      <w:r>
+        <w:rPr>
+          <w:rtl/>
+        </w:rPr>
+        <w:t>ViT</w:t>
+      </w:r>
+      <w:proofErr w:type="spellEnd"/>
+      <w:r>
+        <w:rPr>
+          <w:rtl/>
+        </w:rPr>
+        <w:t xml:space="preserve"> והקריאה ל-</w:t>
+      </w:r>
+      <w:proofErr w:type="spellStart"/>
+      <w:r>
+        <w:rPr>
+          <w:rtl/>
+        </w:rPr>
+        <w:t>Gemini</w:t>
+      </w:r>
+      <w:proofErr w:type="spellEnd"/>
+      <w:r>
+        <w:rPr>
+          <w:rtl/>
+        </w:rPr>
+        <w:t xml:space="preserve"> API. מדד זה קובע ישירות את חוויית השימוש והוא המדד הרגיש ביותר לגודל המודלים ולמספר </w:t>
       </w:r>
       <w:r>
         <w:rPr>
@@ -1313,7 +1801,7 @@
     </w:p>
     <w:p>
       <w:pPr>
-        <w:pStyle w:val="Heading1"/>
+        <w:pStyle w:val="1"/>
         <w:bidi/>
         <w:rPr>
           <w:b/>
@@ -1344,6 +1832,7 @@
         <w:rPr>
           <w:noProof/>
         </w:rPr>
+        <w:lastRenderedPageBreak/>
         <w:drawing>
           <wp:inline distT="0" distB="0" distL="0" distR="0" wp14:anchorId="189E8891" wp14:editId="798CE397">
             <wp:extent cx="5935980" cy="2971800"/>
@@ -1413,7 +1902,51 @@
           <w:szCs w:val="18"/>
           <w:rtl/>
         </w:rPr>
-        <w:t>ממוצעי קריאות יומיים מ-Firebase (/sensor_readings) — 24.6 לעומת 28.6</w:t>
+        <w:t>ממוצעי קריאות יומיים מ-</w:t>
+      </w:r>
+      <w:proofErr w:type="spellStart"/>
+      <w:r>
+        <w:rPr>
+          <w:i/>
+          <w:iCs/>
+          <w:sz w:val="18"/>
+          <w:szCs w:val="18"/>
+          <w:rtl/>
+        </w:rPr>
+        <w:t>Firebase</w:t>
+      </w:r>
+      <w:proofErr w:type="spellEnd"/>
+      <w:r>
+        <w:rPr>
+          <w:i/>
+          <w:iCs/>
+          <w:sz w:val="18"/>
+          <w:szCs w:val="18"/>
+          <w:rtl/>
+        </w:rPr>
+        <w:t xml:space="preserve"> (/</w:t>
+      </w:r>
+      <w:proofErr w:type="spellStart"/>
+      <w:r>
+        <w:rPr>
+          <w:i/>
+          <w:iCs/>
+          <w:sz w:val="18"/>
+          <w:szCs w:val="18"/>
+          <w:rtl/>
+        </w:rPr>
+        <w:t>sensor_readings</w:t>
+      </w:r>
+      <w:proofErr w:type="spellEnd"/>
+      <w:r>
+        <w:rPr>
+          <w:i/>
+          <w:iCs/>
+          <w:sz w:val="18"/>
+          <w:szCs w:val="18"/>
+          <w:rtl/>
+        </w:rPr>
+        <w:t>) — 24.6 לעומת 28.6</w:t>
       </w:r>
     </w:p>
     <w:p>
@@ -1427,7 +1960,35 @@
         <w:rPr>
           <w:rtl/>
         </w:rPr>
-        <w:t>הגרף מציג חתך יומי של הנתונים מ-Firebase (ממוצע קריאות לכל תאריך קלנדרי) עבור שני ימי דגימה:</w:t>
+        <w:t>הגרף מציג חתך יומי של הנתונים מ-</w:t>
+      </w:r>
+      <w:proofErr w:type="spellStart"/>
+      <w:r>
+        <w:rPr>
+          <w:rtl/>
+        </w:rPr>
+        <w:t>Firebase</w:t>
+      </w:r>
+      <w:proofErr w:type="spellEnd"/>
+      <w:r>
+        <w:rPr>
+          <w:rtl/>
+        </w:rPr>
+        <w:t xml:space="preserve"> (ממוצע קריאות לכל תאריך </w:t>
+      </w:r>
+      <w:proofErr w:type="spellStart"/>
+      <w:r>
+        <w:rPr>
+          <w:rtl/>
+        </w:rPr>
+        <w:t>קלנדרי</w:t>
+      </w:r>
+      <w:proofErr w:type="spellEnd"/>
+      <w:r>
+        <w:rPr>
+          <w:rtl/>
+        </w:rPr>
+        <w:t>) עבור שני ימי דגימה:</w:t>
       </w:r>
     </w:p>
     <w:p>
@@ -1484,7 +2045,21 @@
         <w:rPr>
           <w:rtl/>
         </w:rPr>
-        <w:t xml:space="preserve"> בין הימים ניכרת התייבשות תקינה של הקרקע בין השקיות, לצד עלייה בלחות האוויר שנכנסה לטווח האופטימלי של המצע (40–60%). לחות הקרקע והטמפרטורה עדיין גבוהות מהיעד האופטימלי של רוזמרין (15–27°C ו-30–50%), אך מגמת הירידה חיובית. יש לציין כי מדובר בנתוני חיישן גולמיים ללא קליברציה, ולכן נתון הטמפרטורה מייצג מגמה יחסית ולא ערך מוחלט.</w:t>
+        <w:t xml:space="preserve"> בין הימים ניכרת התייבשות תקינה של הקרקע בין השקיות, לצד עלייה בלחות האוויר שנכנסה לטווח האופטימלי של המצע (40–60%). לחות הקרקע והטמפרטורה עדיין גבוהות מהיעד האופטימלי של רוזמרין (15–27°C ו-30–50%), אך מגמת הירידה חיובית. יש לציין כי מדובר בנתוני חיישן גולמיים ללא </w:t>
+      </w:r>
+      <w:proofErr w:type="spellStart"/>
+      <w:r>
+        <w:rPr>
+          <w:rtl/>
+        </w:rPr>
+        <w:t>קליברציה</w:t>
+      </w:r>
+      <w:proofErr w:type="spellEnd"/>
+      <w:r>
+        <w:rPr>
+          <w:rtl/>
+        </w:rPr>
+        <w:t>, ולכן נתון הטמפרטורה מייצג מגמה יחסית ולא ערך מוחלט.</w:t>
       </w:r>
     </w:p>
     <w:p>
@@ -1494,7 +2069,7 @@
     </w:p>
     <w:p>
       <w:pPr>
-        <w:pStyle w:val="Heading1"/>
+        <w:pStyle w:val="1"/>
         <w:bidi/>
         <w:rPr>
           <w:b/>
@@ -1537,7 +2112,77 @@
         <w:rPr>
           <w:rtl/>
         </w:rPr>
-        <w:t>האתגר המרכזי בפרויקט היה היעדר מודל מוכן ב-Hugging Face לזיהוי מחלות בצמח הרוזמרין. כדי לפתור זאת, איתרנו מערך נתונים של למעלה מ-600 תמונות, הכולל רוזמרין בריא לצד שלושה סוגי מחלות שונים. ביצענו תהליך אימון למודל ייעודי על בסיס הדאטאסט הזה, העלינו את המודל המאומן ל-Hugging Face, ובבדיקות הרצה וידאנו שהוא משיג ביצועים תקינים ומזהה את מצבי הצמח בהצלחה.</w:t>
+        <w:t>האתגר המרכזי בפרויקט היה היעדר מודל מוכן ב-</w:t>
+      </w:r>
+      <w:proofErr w:type="spellStart"/>
+      <w:r>
+        <w:rPr>
+          <w:rtl/>
+        </w:rPr>
+        <w:t>Hugging</w:t>
+      </w:r>
+      <w:proofErr w:type="spellEnd"/>
+      <w:r>
+        <w:rPr>
+          <w:rtl/>
+        </w:rPr>
+        <w:t xml:space="preserve"> </w:t>
+      </w:r>
+      <w:proofErr w:type="spellStart"/>
+      <w:r>
+        <w:rPr>
+          <w:rtl/>
+        </w:rPr>
+        <w:t>Face</w:t>
+      </w:r>
+      <w:proofErr w:type="spellEnd"/>
+      <w:r>
+        <w:rPr>
+          <w:rtl/>
+        </w:rPr>
+        <w:t xml:space="preserve"> לזיהוי מחלות בצמח הרוזמרין. כדי לפתור זאת, איתרנו מערך נתונים של למעלה מ-600 תמונות, הכולל רוזמרין בריא לצד שלושה סוגי מחלות שונים. ביצענו תהליך אימון למודל ייעודי על בסיס </w:t>
+      </w:r>
+      <w:proofErr w:type="spellStart"/>
+      <w:r>
+        <w:rPr>
+          <w:rtl/>
+        </w:rPr>
+        <w:t>הדאטאסט</w:t>
+      </w:r>
+      <w:proofErr w:type="spellEnd"/>
+      <w:r>
+        <w:rPr>
+          <w:rtl/>
+        </w:rPr>
+        <w:t xml:space="preserve"> הזה, העלינו את המודל המאומן ל-</w:t>
+      </w:r>
+      <w:proofErr w:type="spellStart"/>
+      <w:r>
+        <w:rPr>
+          <w:rtl/>
+        </w:rPr>
+        <w:t>Hugging</w:t>
+      </w:r>
+      <w:proofErr w:type="spellEnd"/>
+      <w:r>
+        <w:rPr>
+          <w:rtl/>
+        </w:rPr>
+        <w:t xml:space="preserve"> </w:t>
+      </w:r>
+      <w:proofErr w:type="spellStart"/>
+      <w:r>
+        <w:rPr>
+          <w:rtl/>
+        </w:rPr>
+        <w:t>Face</w:t>
+      </w:r>
+      <w:proofErr w:type="spellEnd"/>
+      <w:r>
+        <w:rPr>
+          <w:rtl/>
+        </w:rPr>
+        <w:t>, ובבדיקות הרצה וידאנו שהוא משיג ביצועים תקינים ומזהה את מצבי הצמח בהצלחה.</w:t>
       </w:r>
     </w:p>
     <w:p>
@@ -1563,7 +2208,7 @@
     </w:p>
     <w:p>
       <w:pPr>
-        <w:pStyle w:val="Heading1"/>
+        <w:pStyle w:val="1"/>
         <w:bidi/>
         <w:rPr>
           <w:b/>
@@ -1582,6 +2227,7 @@
           <w:szCs w:val="28"/>
           <w:rtl/>
         </w:rPr>
+        <w:lastRenderedPageBreak/>
         <w:t>6. ממשק משחוק</w:t>
       </w:r>
     </w:p>
@@ -1597,6 +2243,7 @@
         </w:rPr>
         <w:t xml:space="preserve">מנגנון </w:t>
       </w:r>
+      <w:proofErr w:type="spellStart"/>
       <w:r>
         <w:rPr>
           <w:rFonts w:hint="cs"/>
@@ -1606,6 +2253,7 @@
         </w:rPr>
         <w:t>מישחוק</w:t>
       </w:r>
+      <w:proofErr w:type="spellEnd"/>
       <w:r>
         <w:rPr>
           <w:b/>
@@ -1625,18 +2273,49 @@
         </w:rPr>
         <w:t xml:space="preserve">בכל יום </w:t>
       </w:r>
+      <w:proofErr w:type="spellStart"/>
       <w:r>
         <w:rPr>
           <w:rtl/>
         </w:rPr>
         <w:t>הDashboard</w:t>
       </w:r>
-      <w:r>
-        <w:rPr>
-          <w:rtl/>
-        </w:rPr>
-        <w:t xml:space="preserve"> מתרגם את קריאות החיישנים לרשימת משימות טיפול קצרה, וברגע שהמשתמש מסמן אותן כהושלמו, הפונקציה mark_tasks_done מעדכנת את </w:t>
-      </w:r>
+      <w:proofErr w:type="spellEnd"/>
+      <w:r>
+        <w:rPr>
+          <w:rtl/>
+        </w:rPr>
+        <w:t xml:space="preserve"> מתרגם את קריאות החיישנים לרשימת משימות טיפול קצרה, וברגע שהמשתמש מסמן אותן </w:t>
+      </w:r>
+      <w:proofErr w:type="spellStart"/>
+      <w:r>
+        <w:rPr>
+          <w:rtl/>
+        </w:rPr>
+        <w:t>כהושלמו</w:t>
+      </w:r>
+      <w:proofErr w:type="spellEnd"/>
+      <w:r>
+        <w:rPr>
+          <w:rtl/>
+        </w:rPr>
+        <w:t xml:space="preserve">, הפונקציה </w:t>
+      </w:r>
+      <w:proofErr w:type="spellStart"/>
+      <w:r>
+        <w:rPr>
+          <w:rtl/>
+        </w:rPr>
+        <w:t>mark_tasks_done</w:t>
+      </w:r>
+      <w:proofErr w:type="spellEnd"/>
+      <w:r>
+        <w:rPr>
+          <w:rtl/>
+        </w:rPr>
+        <w:t xml:space="preserve"> מעדכנת את </w:t>
+      </w:r>
+      <w:proofErr w:type="spellStart"/>
       <w:r>
         <w:rPr>
           <w:rtl/>
@@ -1650,11 +2329,26 @@
         </w:rPr>
         <w:t>סטריק</w:t>
       </w:r>
-      <w:r>
-        <w:rPr>
-          <w:rtl/>
-        </w:rPr>
-        <w:t xml:space="preserve"> ב-Firebase. אם המשימות הושלמו גם אתמול המונה גדל ב-1, ואם היה דילוג או הפעלה ראשונה הוא מאותחל ל-1 ונשמר ב-DB כדי להבטיח </w:t>
+      <w:proofErr w:type="spellEnd"/>
+      <w:r>
+        <w:rPr>
+          <w:rtl/>
+        </w:rPr>
+        <w:t xml:space="preserve"> ב-</w:t>
+      </w:r>
+      <w:proofErr w:type="spellStart"/>
+      <w:r>
+        <w:rPr>
+          <w:rtl/>
+        </w:rPr>
+        <w:t>Firebase</w:t>
+      </w:r>
+      <w:proofErr w:type="spellEnd"/>
+      <w:r>
+        <w:rPr>
+          <w:rtl/>
+        </w:rPr>
+        <w:t xml:space="preserve">. אם המשימות הושלמו גם אתמול המונה גדל ב-1, ואם היה דילוג או הפעלה ראשונה הוא מאותחל ל-1 ונשמר ב-DB כדי להבטיח </w:t>
       </w:r>
       <w:r>
         <w:rPr>
@@ -1689,7 +2383,160 @@
         <w:rPr>
           <w:rtl/>
         </w:rPr>
-        <w:t xml:space="preserve"> הפונקציה current_streak מציגה את הציון רק אם ההשלמה האחרונה הייתה היום או אתמול; פספוס של יום שלם מאפס את המונה מיד ל-0, מה שמייצר תמרוץ לפעולות טיפול רציפות ועקביות.</w:t>
+        <w:t xml:space="preserve"> הפונקציה </w:t>
+      </w:r>
+      <w:proofErr w:type="spellStart"/>
+      <w:r>
+        <w:rPr>
+          <w:rtl/>
+        </w:rPr>
+        <w:t>current_streak</w:t>
+      </w:r>
+      <w:proofErr w:type="spellEnd"/>
+      <w:r>
+        <w:rPr>
+          <w:rtl/>
+        </w:rPr>
+        <w:t xml:space="preserve"> מציגה את הציון רק אם ההשלמה האחרונה הייתה היום או אתמול; פספוס של יום שלם מאפס את המונה מיד ל-0, מה שמייצר </w:t>
+      </w:r>
+      <w:proofErr w:type="spellStart"/>
+      <w:r>
+        <w:rPr>
+          <w:rtl/>
+        </w:rPr>
+        <w:t>תמרוץ</w:t>
+      </w:r>
+      <w:proofErr w:type="spellEnd"/>
+      <w:r>
+        <w:rPr>
+          <w:rtl/>
+        </w:rPr>
+        <w:t xml:space="preserve"> לפעולות טיפול רציפות ועקביות.</w:t>
+      </w:r>
+    </w:p>
+    <w:p>
+      <w:pPr>
+        <w:spacing w:after="200"/>
+      </w:pPr>
+    </w:p>
+    <w:p>
+      <w:pPr>
+        <w:spacing w:after="200"/>
+        <w:rPr>
+          <w:rFonts w:hint="cs"/>
+          <w:rtl/>
+        </w:rPr>
+      </w:pPr>
+      <w:r>
+        <w:t>*****</w:t>
+      </w:r>
+      <w:r>
+        <w:rPr>
+          <w:rFonts w:hint="cs"/>
+          <w:rtl/>
+        </w:rPr>
+        <w:t xml:space="preserve">הערה לגבי הצ׳אט </w:t>
+      </w:r>
+      <w:proofErr w:type="spellStart"/>
+      <w:r>
+        <w:rPr>
+          <w:rFonts w:hint="cs"/>
+          <w:rtl/>
+        </w:rPr>
+        <w:t>בוט</w:t>
+      </w:r>
+      <w:proofErr w:type="spellEnd"/>
+      <w:r>
+        <w:rPr>
+          <w:rFonts w:hint="cs"/>
+          <w:rtl/>
+        </w:rPr>
+        <w:t xml:space="preserve"> </w:t>
+      </w:r>
+      <w:r>
+        <w:rPr>
+          <w:rtl/>
+        </w:rPr>
+        <w:t>–</w:t>
+      </w:r>
+      <w:r>
+        <w:rPr>
+          <w:rFonts w:hint="cs"/>
+          <w:rtl/>
+        </w:rPr>
+        <w:t xml:space="preserve"> כדי שהוא יעבוד צריך להוסיף מפתח סודי </w:t>
+      </w:r>
+      <w:r>
+        <w:t>(Secrets)</w:t>
+      </w:r>
+      <w:r>
+        <w:rPr>
+          <w:rFonts w:hint="cs"/>
+          <w:rtl/>
+        </w:rPr>
+        <w:t xml:space="preserve"> במחברת של </w:t>
+      </w:r>
+      <w:proofErr w:type="spellStart"/>
+      <w:r>
+        <w:rPr>
+          <w:rFonts w:hint="cs"/>
+          <w:rtl/>
+        </w:rPr>
+        <w:t>הקולאב</w:t>
+      </w:r>
+      <w:proofErr w:type="spellEnd"/>
+      <w:r>
+        <w:rPr>
+          <w:rFonts w:hint="cs"/>
+          <w:rtl/>
+        </w:rPr>
+        <w:t>:</w:t>
+      </w:r>
+      <w:r>
+        <w:rPr>
+          <w:rtl/>
+        </w:rPr>
+        <w:br/>
+      </w:r>
+      <w:r>
+        <w:rPr>
+          <w:rtl/>
+        </w:rPr>
+        <w:br/>
+      </w:r>
+      <w:r>
+        <w:rPr>
+          <w:rFonts w:hint="cs"/>
+          <w:rtl/>
+        </w:rPr>
+        <w:t xml:space="preserve">שם המפתח הוא: </w:t>
+      </w:r>
+      <w:r>
+        <w:t>chatbot</w:t>
+      </w:r>
+      <w:r>
+        <w:br/>
+      </w:r>
+      <w:r>
+        <w:rPr>
+          <w:rFonts w:hint="cs"/>
+          <w:rtl/>
+        </w:rPr>
+        <w:t xml:space="preserve">ערך המפתח הוא: </w:t>
+      </w:r>
+      <w:proofErr w:type="gramStart"/>
+      <w:r>
+        <w:t>AQ.Ab</w:t>
+      </w:r>
+      <w:proofErr w:type="gramEnd"/>
+      <w:r>
+        <w:t>8RN6ImR5x21SEQmOQXJ23zr_xuSGJO6d0ftSs7FiPB34OGzw</w:t>
+      </w:r>
+      <w:r>
+        <w:rPr>
+          <w:rtl/>
+        </w:rPr>
+        <w:br/>
       </w:r>
     </w:p>
     <w:sectPr>
@@ -1703,7 +2550,7 @@
 </file>
 
 <file path=word/numbering.xml><?xml version="1.0" encoding="utf-8"?>
-<w:numbering xmlns:wpc="http://schemas.microsoft.com/office/word/2010/wordprocessingCanvas" xmlns:cx="http://schemas.microsoft.com/office/drawing/2014/chartex" xmlns:cx1="http://schemas.microsoft.com/office/drawing/2015/9/8/chartex" xmlns:cx2="http://schemas.microsoft.com/office/drawing/2015/10/21/chartex" xmlns:cx3="http://schemas.microsoft.com/office/drawing/2016/5/9/chartex" xmlns:cx4="http://schemas.microsoft.com/office/drawing/2016/5/10/chartex" xmlns:cx5="http://schemas.microsoft.com/office/drawing/2016/5/11/chartex" xmlns:cx6="http://schemas.microsoft.com/office/drawing/2016/5/12/chartex" xmlns:cx7="http://schemas.microsoft.com/office/drawing/2016/5/13/chartex" xmlns:cx8="http://schemas.microsoft.com/office/drawing/2016/5/14/chartex" xmlns:mc="http://schemas.openxmlformats.org/markup-compatibility/2006" xmlns:aink="http://schemas.microsoft.com/office/drawing/2016/ink" xmlns:am3d="http://schemas.microsoft.com/office/drawing/2017/model3d" xmlns:o="urn:schemas-microsoft-com:office:office" xmlns:oel="http://schemas.microsoft.com/office/2019/extlst" xmlns:r="http://schemas.openxmlformats.org/officeDocument/2006/relationships" xmlns:m="http://schemas.openxmlformats.org/officeDocument/2006/math" xmlns:v="urn:schemas-microsoft-com:vml" xmlns:wp14="http://schemas.microsoft.com/office/word/2010/wordprocessingDrawing" xmlns:wp="http://schemas.openxmlformats.org/drawingml/2006/wordprocessingDrawing" xmlns:w10="urn:schemas-microsoft-com:office:word" xmlns:w="http://schemas.openxmlformats.org/wordprocessingml/2006/main" xmlns:w14="http://schemas.microsoft.com/office/word/2010/wordml" xmlns:w15="http://schemas.microsoft.com/office/word/2012/wordml" xmlns:w16cex="http://schemas.microsoft.com/office/word/2018/wordml/cex" xmlns:w16cid="http://schemas.microsoft.com/office/word/2016/wordml/cid" xmlns:w16="http://schemas.microsoft.com/office/word/2018/wordml" xmlns:w16du="http://schemas.microsoft.com/office/word/2023/wordml/word16du" xmlns:w16sdtdh="http://schemas.microsoft.com/office/word/2020/wordml/sdtdatahash" xmlns:w16sdtfl="http://schemas.microsoft.com/office/word/2024/wordml/sdtformatlock" xmlns:w16se="http://schemas.microsoft.com/office/word/2015/wordml/symex" xmlns:wpg="http://schemas.microsoft.com/office/word/2010/wordprocessingGroup" xmlns:wpi="http://schemas.microsoft.com/office/word/2010/wordprocessingInk" xmlns:wne="http://schemas.microsoft.com/office/word/2006/wordml" xmlns:wps="http://schemas.microsoft.com/office/word/2010/wordprocessingShape" mc:Ignorable="w14 w15 w16se w16cid w16 w16cex w16sdtdh w16sdtfl w16du wp14">
+<w:numbering xmlns:wpc="http://schemas.microsoft.com/office/word/2010/wordprocessingCanvas" xmlns:cx="http://schemas.microsoft.com/office/drawing/2014/chartex" xmlns:cx1="http://schemas.microsoft.com/office/drawing/2015/9/8/chartex" xmlns:cx2="http://schemas.microsoft.com/office/drawing/2015/10/21/chartex" xmlns:cx3="http://schemas.microsoft.com/office/drawing/2016/5/9/chartex" xmlns:cx4="http://schemas.microsoft.com/office/drawing/2016/5/10/chartex" xmlns:cx5="http://schemas.microsoft.com/office/drawing/2016/5/11/chartex" xmlns:cx6="http://schemas.microsoft.com/office/drawing/2016/5/12/chartex" xmlns:cx7="http://schemas.microsoft.com/office/drawing/2016/5/13/chartex" xmlns:cx8="http://schemas.microsoft.com/office/drawing/2016/5/14/chartex" xmlns:mc="http://schemas.openxmlformats.org/markup-compatibility/2006" xmlns:aink="http://schemas.microsoft.com/office/drawing/2016/ink" xmlns:am3d="http://schemas.microsoft.com/office/drawing/2017/model3d" xmlns:o="urn:schemas-microsoft-com:office:office" xmlns:oel="http://schemas.microsoft.com/office/2019/extlst" xmlns:r="http://schemas.openxmlformats.org/officeDocument/2006/relationships" xmlns:m="http://schemas.openxmlformats.org/officeDocument/2006/math" xmlns:v="urn:schemas-microsoft-com:vml" xmlns:wp14="http://schemas.microsoft.com/office/word/2010/wordprocessingDrawing" xmlns:wp="http://schemas.openxmlformats.org/drawingml/2006/wordprocessingDrawing" xmlns:w10="urn:schemas-microsoft-com:office:word" xmlns:w="http://schemas.openxmlformats.org/wordprocessingml/2006/main" xmlns:w14="http://schemas.microsoft.com/office/word/2010/wordml" xmlns:w15="http://schemas.microsoft.com/office/word/2012/wordml" xmlns:w16cex="http://schemas.microsoft.com/office/word/2018/wordml/cex" xmlns:w16cid="http://schemas.microsoft.com/office/word/2016/wordml/cid" xmlns:w16="http://schemas.microsoft.com/office/word/2018/wordml" xmlns:w16sdtdh="http://schemas.microsoft.com/office/word/2020/wordml/sdtdatahash" xmlns:w16se="http://schemas.microsoft.com/office/word/2015/wordml/symex" xmlns:wpg="http://schemas.microsoft.com/office/word/2010/wordprocessingGroup" xmlns:wpi="http://schemas.microsoft.com/office/word/2010/wordprocessingInk" xmlns:wne="http://schemas.microsoft.com/office/word/2006/wordml" xmlns:wps="http://schemas.microsoft.com/office/word/2010/wordprocessingShape" mc:Ignorable="w14 w15 w16se w16cid w16 w16cex w16sdtdh wp14">
   <w:abstractNum w:abstractNumId="0" w15:restartNumberingAfterBreak="0">
     <w:nsid w:val="1174459C"/>
     <w:multiLevelType w:val="hybridMultilevel"/>
@@ -1892,7 +2739,7 @@
 </file>
 
 <file path=word/styles.xml><?xml version="1.0" encoding="utf-8"?>
-<w:styles xmlns:mc="http://schemas.openxmlformats.org/markup-compatibility/2006" xmlns:r="http://schemas.openxmlformats.org/officeDocument/2006/relationships" xmlns:w="http://schemas.openxmlformats.org/wordprocessingml/2006/main" xmlns:w14="http://schemas.microsoft.com/office/word/2010/wordml" xmlns:w15="http://schemas.microsoft.com/office/word/2012/wordml" xmlns:w16cex="http://schemas.microsoft.com/office/word/2018/wordml/cex" xmlns:w16cid="http://schemas.microsoft.com/office/word/2016/wordml/cid" xmlns:w16="http://schemas.microsoft.com/office/word/2018/wordml" xmlns:w16du="http://schemas.microsoft.com/office/word/2023/wordml/word16du" xmlns:w16sdtdh="http://schemas.microsoft.com/office/word/2020/wordml/sdtdatahash" xmlns:w16sdtfl="http://schemas.microsoft.com/office/word/2024/wordml/sdtformatlock" xmlns:w16se="http://schemas.microsoft.com/office/word/2015/wordml/symex" mc:Ignorable="w14 w15 w16se w16cid w16 w16cex w16sdtdh w16sdtfl w16du">
+<w:styles xmlns:mc="http://schemas.openxmlformats.org/markup-compatibility/2006" xmlns:r="http://schemas.openxmlformats.org/officeDocument/2006/relationships" xmlns:w="http://schemas.openxmlformats.org/wordprocessingml/2006/main" xmlns:w14="http://schemas.microsoft.com/office/word/2010/wordml" xmlns:w15="http://schemas.microsoft.com/office/word/2012/wordml" xmlns:w16cex="http://schemas.microsoft.com/office/word/2018/wordml/cex" xmlns:w16cid="http://schemas.microsoft.com/office/word/2016/wordml/cid" xmlns:w16="http://schemas.microsoft.com/office/word/2018/wordml" xmlns:w16sdtdh="http://schemas.microsoft.com/office/word/2020/wordml/sdtdatahash" xmlns:w16se="http://schemas.microsoft.com/office/word/2015/wordml/symex" mc:Ignorable="w14 w15 w16se w16cid w16 w16cex w16sdtdh">
   <w:docDefaults>
     <w:rPrDefault>
       <w:rPr>
@@ -2282,14 +3129,14 @@
     <w:lsdException w:name="Unresolved Mention" w:semiHidden="1" w:unhideWhenUsed="1"/>
     <w:lsdException w:name="Smart Link" w:semiHidden="1" w:unhideWhenUsed="1"/>
   </w:latentStyles>
-  <w:style w:type="paragraph" w:default="1" w:styleId="Normal">
+  <w:style w:type="paragraph" w:default="1" w:styleId="a">
     <w:name w:val="Normal"/>
     <w:qFormat/>
     <w:pPr>
       <w:bidi/>
     </w:pPr>
   </w:style>
-  <w:style w:type="paragraph" w:styleId="Heading1">
+  <w:style w:type="paragraph" w:styleId="1">
     <w:name w:val="heading 1"/>
     <w:uiPriority w:val="9"/>
     <w:qFormat/>
@@ -2302,7 +3149,7 @@
       <w:szCs w:val="32"/>
     </w:rPr>
   </w:style>
-  <w:style w:type="paragraph" w:styleId="Heading2">
+  <w:style w:type="paragraph" w:styleId="2">
     <w:name w:val="heading 2"/>
     <w:uiPriority w:val="9"/>
     <w:semiHidden/>
@@ -2317,7 +3164,7 @@
       <w:szCs w:val="26"/>
     </w:rPr>
   </w:style>
-  <w:style w:type="paragraph" w:styleId="Heading3">
+  <w:style w:type="paragraph" w:styleId="3">
     <w:name w:val="heading 3"/>
     <w:uiPriority w:val="9"/>
     <w:semiHidden/>
@@ -2330,7 +3177,7 @@
       <w:color w:val="1F4D78"/>
     </w:rPr>
   </w:style>
-  <w:style w:type="paragraph" w:styleId="Heading4">
+  <w:style w:type="paragraph" w:styleId="4">
     <w:name w:val="heading 4"/>
     <w:uiPriority w:val="9"/>
     <w:semiHidden/>
@@ -2345,7 +3192,7 @@
       <w:color w:val="2E74B5"/>
     </w:rPr>
   </w:style>
-  <w:style w:type="paragraph" w:styleId="Heading5">
+  <w:style w:type="paragraph" w:styleId="5">
     <w:name w:val="heading 5"/>
     <w:uiPriority w:val="9"/>
     <w:semiHidden/>
@@ -2358,7 +3205,7 @@
       <w:color w:val="2E74B5"/>
     </w:rPr>
   </w:style>
-  <w:style w:type="paragraph" w:styleId="Heading6">
+  <w:style w:type="paragraph" w:styleId="6">
     <w:name w:val="heading 6"/>
     <w:uiPriority w:val="9"/>
     <w:semiHidden/>
@@ -2371,12 +3218,13 @@
       <w:color w:val="1F4D78"/>
     </w:rPr>
   </w:style>
-  <w:style w:type="character" w:default="1" w:styleId="DefaultParagraphFont">
+  <w:style w:type="character" w:default="1" w:styleId="a0">
     <w:name w:val="Default Paragraph Font"/>
     <w:uiPriority w:val="1"/>
+    <w:semiHidden/>
     <w:unhideWhenUsed/>
   </w:style>
-  <w:style w:type="table" w:default="1" w:styleId="TableNormal">
+  <w:style w:type="table" w:default="1" w:styleId="a1">
     <w:name w:val="Normal Table"/>
     <w:uiPriority w:val="99"/>
     <w:semiHidden/>
@@ -2391,13 +3239,13 @@
       </w:tblCellMar>
     </w:tblPr>
   </w:style>
-  <w:style w:type="numbering" w:default="1" w:styleId="NoList">
+  <w:style w:type="numbering" w:default="1" w:styleId="a2">
     <w:name w:val="No List"/>
     <w:uiPriority w:val="99"/>
     <w:semiHidden/>
     <w:unhideWhenUsed/>
   </w:style>
-  <w:style w:type="paragraph" w:styleId="Title">
+  <w:style w:type="paragraph" w:styleId="a3">
     <w:name w:val="Title"/>
     <w:uiPriority w:val="10"/>
     <w:qFormat/>
@@ -2406,7 +3254,7 @@
       <w:szCs w:val="56"/>
     </w:rPr>
   </w:style>
-  <w:style w:type="paragraph" w:customStyle="1" w:styleId="1">
+  <w:style w:type="paragraph" w:customStyle="1" w:styleId="10">
     <w:name w:val="חזק1"/>
     <w:qFormat/>
     <w:rPr>
@@ -2414,7 +3262,7 @@
       <w:bCs/>
     </w:rPr>
   </w:style>
-  <w:style w:type="paragraph" w:styleId="ListParagraph">
+  <w:style w:type="paragraph" w:styleId="a4">
     <w:name w:val="List Paragraph"/>
     <w:qFormat/>
   </w:style>
@@ -2427,7 +3275,7 @@
       <w:u w:val="single"/>
     </w:rPr>
   </w:style>
-  <w:style w:type="character" w:styleId="FootnoteReference">
+  <w:style w:type="character" w:styleId="a5">
     <w:name w:val="footnote reference"/>
     <w:uiPriority w:val="99"/>
     <w:semiHidden/>
@@ -2436,9 +3284,9 @@
       <w:vertAlign w:val="superscript"/>
     </w:rPr>
   </w:style>
-  <w:style w:type="paragraph" w:styleId="FootnoteText">
+  <w:style w:type="paragraph" w:styleId="a6">
     <w:name w:val="footnote text"/>
-    <w:link w:val="FootnoteTextChar"/>
+    <w:link w:val="a7"/>
     <w:uiPriority w:val="99"/>
     <w:semiHidden/>
     <w:unhideWhenUsed/>
@@ -2447,9 +3295,9 @@
       <w:szCs w:val="20"/>
     </w:rPr>
   </w:style>
-  <w:style w:type="character" w:customStyle="1" w:styleId="FootnoteTextChar">
-    <w:name w:val="Footnote Text Char"/>
-    <w:link w:val="FootnoteText"/>
+  <w:style w:type="character" w:customStyle="1" w:styleId="a7">
+    <w:name w:val="טקסט הערת שוליים תו"/>
+    <w:link w:val="a6"/>
     <w:uiPriority w:val="99"/>
     <w:semiHidden/>
     <w:unhideWhenUsed/>
@@ -2458,7 +3306,7 @@
       <w:szCs w:val="20"/>
     </w:rPr>
   </w:style>
-  <w:style w:type="character" w:styleId="EndnoteReference">
+  <w:style w:type="character" w:styleId="a8">
     <w:name w:val="endnote reference"/>
     <w:uiPriority w:val="99"/>
     <w:semiHidden/>
@@ -2467,9 +3315,9 @@
       <w:vertAlign w:val="superscript"/>
     </w:rPr>
   </w:style>
-  <w:style w:type="paragraph" w:styleId="EndnoteText">
+  <w:style w:type="paragraph" w:styleId="a9">
     <w:name w:val="endnote text"/>
-    <w:link w:val="EndnoteTextChar"/>
+    <w:link w:val="aa"/>
     <w:uiPriority w:val="99"/>
     <w:semiHidden/>
     <w:unhideWhenUsed/>
@@ -2478,9 +3326,9 @@
       <w:szCs w:val="20"/>
     </w:rPr>
   </w:style>
-  <w:style w:type="character" w:customStyle="1" w:styleId="EndnoteTextChar">
-    <w:name w:val="Endnote Text Char"/>
-    <w:link w:val="EndnoteText"/>
+  <w:style w:type="character" w:customStyle="1" w:styleId="aa">
+    <w:name w:val="טקסט הערת סיום תו"/>
+    <w:link w:val="a9"/>
     <w:uiPriority w:val="99"/>
     <w:semiHidden/>
     <w:unhideWhenUsed/>
@@ -2491,7 +3339,7 @@
   </w:style>
   <w:style w:type="paragraph" w:styleId="NormalWeb">
     <w:name w:val="Normal (Web)"/>
-    <w:basedOn w:val="Normal"/>
+    <w:basedOn w:val="a"/>
     <w:uiPriority w:val="99"/>
     <w:semiHidden/>
     <w:unhideWhenUsed/>

</xml_diff>